<commit_message>
notes and git command changed
</commit_message>
<xml_diff>
--- a/Notes/GIT Commands.docx
+++ b/Notes/GIT Commands.docx
@@ -155,14 +155,739 @@
     <w:p>
       <w:pPr>
         <w:pStyle w:val="ListParagraph"/>
+        <w:rPr>
+          <w:color w:val="EE0000"/>
+        </w:rPr>
+      </w:pPr>
+    </w:p>
+    <w:p>
+      <w:pPr>
+        <w:pStyle w:val="ListParagraph"/>
+        <w:rPr>
+          <w:color w:val="EE0000"/>
+        </w:rPr>
+      </w:pPr>
+    </w:p>
+    <w:p>
+      <w:pPr>
+        <w:pStyle w:val="ListParagraph"/>
+      </w:pPr>
+      <w:r>
+        <w:t xml:space="preserve">Now in </w:t>
+      </w:r>
+      <w:proofErr w:type="gramStart"/>
+      <w:r>
+        <w:t>main</w:t>
+      </w:r>
+      <w:proofErr w:type="gramEnd"/>
+      <w:r>
+        <w:t xml:space="preserve"> I have all the files </w:t>
+      </w:r>
+    </w:p>
+    <w:p>
+      <w:pPr>
+        <w:pStyle w:val="ListParagraph"/>
         <w:numPr>
           <w:ilvl w:val="0"/>
-          <w:numId w:val="1"/>
+          <w:numId w:val="2"/>
         </w:numPr>
-        <w:rPr>
-          <w:color w:val="EE0000"/>
-        </w:rPr>
-      </w:pPr>
+      </w:pPr>
+      <w:r>
+        <w:t xml:space="preserve">Project – order </w:t>
+      </w:r>
+      <w:proofErr w:type="spellStart"/>
+      <w:r>
+        <w:t>api</w:t>
+      </w:r>
+      <w:proofErr w:type="spellEnd"/>
+      <w:r>
+        <w:t xml:space="preserve"> and product </w:t>
+      </w:r>
+      <w:proofErr w:type="spellStart"/>
+      <w:r>
+        <w:t>api</w:t>
+      </w:r>
+      <w:proofErr w:type="spellEnd"/>
+    </w:p>
+    <w:p>
+      <w:pPr>
+        <w:pStyle w:val="ListParagraph"/>
+        <w:numPr>
+          <w:ilvl w:val="0"/>
+          <w:numId w:val="2"/>
+        </w:numPr>
+      </w:pPr>
+      <w:r>
+        <w:t xml:space="preserve">Files like Dependency injection notes, Microservices </w:t>
+      </w:r>
+      <w:proofErr w:type="spellStart"/>
+      <w:r>
+        <w:t>etc</w:t>
+      </w:r>
+      <w:proofErr w:type="spellEnd"/>
+    </w:p>
+    <w:p>
+      <w:r>
+        <w:t>Now in branch “</w:t>
+      </w:r>
+      <w:proofErr w:type="spellStart"/>
+      <w:r>
+        <w:t>ecommer-api</w:t>
+      </w:r>
+      <w:proofErr w:type="spellEnd"/>
+      <w:r>
+        <w:t xml:space="preserve">” I have the extra file pushed as “Microservice Tutorials” along with </w:t>
+      </w:r>
+      <w:r>
+        <w:t>other files that are already in the main</w:t>
+      </w:r>
+      <w:r>
+        <w:t xml:space="preserve">, now I need to push this </w:t>
+      </w:r>
+      <w:proofErr w:type="gramStart"/>
+      <w:r>
+        <w:t xml:space="preserve">particular </w:t>
+      </w:r>
+      <w:r>
+        <w:t>microservice</w:t>
+      </w:r>
+      <w:proofErr w:type="gramEnd"/>
+      <w:r>
+        <w:t xml:space="preserve"> tutorial file alone to the main from this branch instead of the entire files </w:t>
+      </w:r>
+      <w:r>
+        <w:t>which already exist in the main</w:t>
+      </w:r>
+    </w:p>
+    <w:p>
+      <w:pPr>
+        <w:rPr>
+          <w:b/>
+          <w:bCs/>
+        </w:rPr>
+      </w:pPr>
+      <w:proofErr w:type="gramStart"/>
+      <w:r>
+        <w:rPr>
+          <w:b/>
+          <w:bCs/>
+        </w:rPr>
+        <w:t>Traditional  ways</w:t>
+      </w:r>
+      <w:proofErr w:type="gramEnd"/>
+    </w:p>
+    <w:p>
+      <w:pPr>
+        <w:pStyle w:val="ListParagraph"/>
+        <w:numPr>
+          <w:ilvl w:val="0"/>
+          <w:numId w:val="3"/>
+        </w:numPr>
+      </w:pPr>
+      <w:r>
+        <w:t>git checkout main</w:t>
+      </w:r>
+      <w:r>
+        <w:t xml:space="preserve"> – switch to main</w:t>
+      </w:r>
+    </w:p>
+    <w:p>
+      <w:pPr>
+        <w:pStyle w:val="ListParagraph"/>
+        <w:numPr>
+          <w:ilvl w:val="0"/>
+          <w:numId w:val="3"/>
+        </w:numPr>
+      </w:pPr>
+      <w:r>
+        <w:t>git pull origin main</w:t>
+      </w:r>
+      <w:r>
+        <w:t xml:space="preserve"> – pull lates main</w:t>
+      </w:r>
+    </w:p>
+    <w:p>
+      <w:pPr>
+        <w:pStyle w:val="ListParagraph"/>
+        <w:numPr>
+          <w:ilvl w:val="0"/>
+          <w:numId w:val="3"/>
+        </w:numPr>
+      </w:pPr>
+      <w:r>
+        <w:t>git checkout ecommerce-</w:t>
+      </w:r>
+      <w:proofErr w:type="spellStart"/>
+      <w:r>
+        <w:t>api</w:t>
+      </w:r>
+      <w:proofErr w:type="spellEnd"/>
+      <w:r>
+        <w:t xml:space="preserve"> -- "microservice tutorial"</w:t>
+      </w:r>
+    </w:p>
+    <w:p>
+      <w:pPr>
+        <w:pStyle w:val="ListParagraph"/>
+      </w:pPr>
+      <w:r>
+        <w:t>It copies that single file from ecommerce-</w:t>
+      </w:r>
+      <w:proofErr w:type="spellStart"/>
+      <w:r>
+        <w:t>api</w:t>
+      </w:r>
+      <w:proofErr w:type="spellEnd"/>
+      <w:r>
+        <w:t xml:space="preserve"> branch into your current branch (main).</w:t>
+      </w:r>
+    </w:p>
+    <w:p>
+      <w:pPr>
+        <w:pStyle w:val="ListParagraph"/>
+        <w:rPr>
+          <w:b/>
+          <w:bCs/>
+        </w:rPr>
+      </w:pPr>
+      <w:r>
+        <w:rPr>
+          <w:b/>
+          <w:bCs/>
+        </w:rPr>
+        <w:t xml:space="preserve">Commit </w:t>
+      </w:r>
+      <w:r>
+        <w:rPr>
+          <w:b/>
+          <w:bCs/>
+        </w:rPr>
+        <w:t xml:space="preserve">and push </w:t>
+      </w:r>
+      <w:r>
+        <w:rPr>
+          <w:b/>
+          <w:bCs/>
+        </w:rPr>
+        <w:t xml:space="preserve">the above in </w:t>
+      </w:r>
+      <w:proofErr w:type="gramStart"/>
+      <w:r>
+        <w:rPr>
+          <w:b/>
+          <w:bCs/>
+        </w:rPr>
+        <w:t>main</w:t>
+      </w:r>
+      <w:proofErr w:type="gramEnd"/>
+    </w:p>
+    <w:p>
+      <w:pPr>
+        <w:pStyle w:val="ListParagraph"/>
+        <w:numPr>
+          <w:ilvl w:val="0"/>
+          <w:numId w:val="3"/>
+        </w:numPr>
+      </w:pPr>
+      <w:r>
+        <w:t>git add "microservice tutorial"</w:t>
+      </w:r>
+    </w:p>
+    <w:p>
+      <w:pPr>
+        <w:pStyle w:val="ListParagraph"/>
+      </w:pPr>
+      <w:r>
+        <w:t>git commit -m "Added microservice tutorial from ecommerce branch"</w:t>
+      </w:r>
+    </w:p>
+    <w:p>
+      <w:pPr>
+        <w:pStyle w:val="ListParagraph"/>
+      </w:pPr>
+      <w:r>
+        <w:t>git push origin main</w:t>
+      </w:r>
+      <w:r>
+        <w:t xml:space="preserve"> -- </w:t>
+      </w:r>
+      <w:r>
+        <w:t>Only that file is moved.</w:t>
+      </w:r>
+    </w:p>
+    <w:p>
+      <w:pPr>
+        <w:pStyle w:val="ListParagraph"/>
+      </w:pPr>
+    </w:p>
+    <w:p>
+      <w:pPr>
+        <w:pStyle w:val="ListParagraph"/>
+        <w:rPr>
+          <w:b/>
+          <w:bCs/>
+        </w:rPr>
+      </w:pPr>
+      <w:r>
+        <w:rPr>
+          <w:b/>
+          <w:bCs/>
+        </w:rPr>
+        <w:t>Alternative Method (Advanced – Cherry Pick)</w:t>
+      </w:r>
+    </w:p>
+    <w:p>
+      <w:pPr>
+        <w:pStyle w:val="ListParagraph"/>
+        <w:rPr>
+          <w:b/>
+          <w:bCs/>
+        </w:rPr>
+      </w:pPr>
+      <w:r>
+        <w:rPr>
+          <w:b/>
+          <w:bCs/>
+        </w:rPr>
+        <w:t>Take one specific commit from one branch and apply it to another branch.</w:t>
+      </w:r>
+    </w:p>
+    <w:p>
+      <w:pPr>
+        <w:pStyle w:val="ListParagraph"/>
+        <w:rPr>
+          <w:b/>
+          <w:bCs/>
+        </w:rPr>
+      </w:pPr>
+      <w:r>
+        <w:rPr>
+          <w:b/>
+          <w:bCs/>
+        </w:rPr>
+        <w:t>Here the cherry pick works for single commit only</w:t>
+      </w:r>
+    </w:p>
+    <w:p>
+      <w:pPr>
+        <w:pStyle w:val="ListParagraph"/>
+        <w:numPr>
+          <w:ilvl w:val="0"/>
+          <w:numId w:val="4"/>
+        </w:numPr>
+      </w:pPr>
+      <w:r>
+        <w:t xml:space="preserve">First find the commit </w:t>
+      </w:r>
+      <w:proofErr w:type="gramStart"/>
+      <w:r>
+        <w:t>id  --</w:t>
+      </w:r>
+      <w:proofErr w:type="gramEnd"/>
+      <w:r>
+        <w:t xml:space="preserve"> git log</w:t>
+      </w:r>
+    </w:p>
+    <w:p>
+      <w:pPr>
+        <w:pStyle w:val="ListParagraph"/>
+        <w:numPr>
+          <w:ilvl w:val="0"/>
+          <w:numId w:val="4"/>
+        </w:numPr>
+      </w:pPr>
+      <w:r>
+        <w:t>Switch to main – git checkout main</w:t>
+      </w:r>
+    </w:p>
+    <w:p>
+      <w:pPr>
+        <w:pStyle w:val="ListParagraph"/>
+        <w:numPr>
+          <w:ilvl w:val="0"/>
+          <w:numId w:val="4"/>
+        </w:numPr>
+      </w:pPr>
+      <w:proofErr w:type="spellStart"/>
+      <w:r>
+        <w:t>Cherrypick</w:t>
+      </w:r>
+      <w:proofErr w:type="spellEnd"/>
+      <w:r>
+        <w:t xml:space="preserve"> that commit -- </w:t>
+      </w:r>
+      <w:r>
+        <w:t>git cherry-pick a3f5k9d8912345</w:t>
+      </w:r>
+      <w:r>
+        <w:t>(here give the commit id)</w:t>
+      </w:r>
+    </w:p>
+    <w:p>
+      <w:pPr>
+        <w:pStyle w:val="ListParagraph"/>
+      </w:pPr>
+      <w:r>
+        <w:t xml:space="preserve">Now Git takes that exact </w:t>
+      </w:r>
+      <w:proofErr w:type="gramStart"/>
+      <w:r>
+        <w:t>commit</w:t>
+      </w:r>
+      <w:proofErr w:type="gramEnd"/>
+      <w:r>
+        <w:t xml:space="preserve"> and applies it </w:t>
+      </w:r>
+      <w:proofErr w:type="gramStart"/>
+      <w:r>
+        <w:t>to</w:t>
+      </w:r>
+      <w:proofErr w:type="gramEnd"/>
+      <w:r>
+        <w:t xml:space="preserve"> main.</w:t>
+      </w:r>
+    </w:p>
+    <w:p>
+      <w:pPr>
+        <w:pStyle w:val="ListParagraph"/>
+      </w:pPr>
+    </w:p>
+    <w:p>
+      <w:pPr>
+        <w:pStyle w:val="ListParagraph"/>
+      </w:pPr>
+    </w:p>
+    <w:p>
+      <w:pPr>
+        <w:pStyle w:val="ListParagraph"/>
+      </w:pPr>
+    </w:p>
+    <w:p>
+      <w:pPr>
+        <w:pStyle w:val="ListParagraph"/>
+      </w:pPr>
+      <w:r>
+        <w:lastRenderedPageBreak/>
+        <w:t>What happens after giving Cherry pick command</w:t>
+      </w:r>
+    </w:p>
+    <w:p>
+      <w:pPr>
+        <w:pStyle w:val="ListParagraph"/>
+      </w:pPr>
+      <w:r>
+        <w:drawing>
+          <wp:inline distT="0" distB="0" distL="0" distR="0" wp14:anchorId="1209523E" wp14:editId="3BE84565">
+            <wp:extent cx="4421875" cy="3299871"/>
+            <wp:effectExtent l="0" t="0" r="0" b="0"/>
+            <wp:docPr id="33964551" name="Picture 1"/>
+            <wp:cNvGraphicFramePr>
+              <a:graphicFrameLocks xmlns:a="http://schemas.openxmlformats.org/drawingml/2006/main" noChangeAspect="1"/>
+            </wp:cNvGraphicFramePr>
+            <a:graphic xmlns:a="http://schemas.openxmlformats.org/drawingml/2006/main">
+              <a:graphicData uri="http://schemas.openxmlformats.org/drawingml/2006/picture">
+                <pic:pic xmlns:pic="http://schemas.openxmlformats.org/drawingml/2006/picture">
+                  <pic:nvPicPr>
+                    <pic:cNvPr id="33964551" name=""/>
+                    <pic:cNvPicPr/>
+                  </pic:nvPicPr>
+                  <pic:blipFill>
+                    <a:blip r:embed="rId5"/>
+                    <a:stretch>
+                      <a:fillRect/>
+                    </a:stretch>
+                  </pic:blipFill>
+                  <pic:spPr>
+                    <a:xfrm>
+                      <a:off x="0" y="0"/>
+                      <a:ext cx="4428999" cy="3305188"/>
+                    </a:xfrm>
+                    <a:prstGeom prst="rect">
+                      <a:avLst/>
+                    </a:prstGeom>
+                  </pic:spPr>
+                </pic:pic>
+              </a:graphicData>
+            </a:graphic>
+          </wp:inline>
+        </w:drawing>
+      </w:r>
+    </w:p>
+    <w:p>
+      <w:pPr>
+        <w:pStyle w:val="ListParagraph"/>
+      </w:pPr>
+    </w:p>
+    <w:p>
+      <w:pPr>
+        <w:pStyle w:val="ListParagraph"/>
+        <w:rPr>
+          <w:b/>
+          <w:bCs/>
+        </w:rPr>
+      </w:pPr>
+      <w:r>
+        <w:rPr>
+          <w:b/>
+          <w:bCs/>
+        </w:rPr>
+        <w:t>Cherry Pick vs Merge</w:t>
+      </w:r>
+    </w:p>
+    <w:tbl>
+      <w:tblPr>
+        <w:tblW w:w="0" w:type="auto"/>
+        <w:tblCellSpacing w:w="15" w:type="dxa"/>
+        <w:tblCellMar>
+          <w:top w:w="15" w:type="dxa"/>
+          <w:left w:w="15" w:type="dxa"/>
+          <w:bottom w:w="15" w:type="dxa"/>
+          <w:right w:w="15" w:type="dxa"/>
+        </w:tblCellMar>
+        <w:tblLook w:val="04A0" w:firstRow="1" w:lastRow="0" w:firstColumn="1" w:lastColumn="0" w:noHBand="0" w:noVBand="1"/>
+      </w:tblPr>
+      <w:tblGrid>
+        <w:gridCol w:w="4146"/>
+        <w:gridCol w:w="4796"/>
+      </w:tblGrid>
+      <w:tr>
+        <w:trPr>
+          <w:tblHeader/>
+          <w:tblCellSpacing w:w="15" w:type="dxa"/>
+        </w:trPr>
+        <w:tc>
+          <w:tcPr>
+            <w:tcW w:w="0" w:type="auto"/>
+            <w:vAlign w:val="center"/>
+            <w:hideMark/>
+          </w:tcPr>
+          <w:p>
+            <w:pPr>
+              <w:pStyle w:val="ListParagraph"/>
+              <w:rPr>
+                <w:b/>
+                <w:bCs/>
+              </w:rPr>
+            </w:pPr>
+            <w:r>
+              <w:rPr>
+                <w:b/>
+                <w:bCs/>
+              </w:rPr>
+              <w:t>Merge</w:t>
+            </w:r>
+          </w:p>
+        </w:tc>
+        <w:tc>
+          <w:tcPr>
+            <w:tcW w:w="0" w:type="auto"/>
+            <w:vAlign w:val="center"/>
+            <w:hideMark/>
+          </w:tcPr>
+          <w:p>
+            <w:pPr>
+              <w:pStyle w:val="ListParagraph"/>
+              <w:rPr>
+                <w:b/>
+                <w:bCs/>
+              </w:rPr>
+            </w:pPr>
+            <w:r>
+              <w:rPr>
+                <w:b/>
+                <w:bCs/>
+              </w:rPr>
+              <w:t>Cherry Pick</w:t>
+            </w:r>
+          </w:p>
+        </w:tc>
+      </w:tr>
+      <w:tr>
+        <w:trPr>
+          <w:tblCellSpacing w:w="15" w:type="dxa"/>
+        </w:trPr>
+        <w:tc>
+          <w:tcPr>
+            <w:tcW w:w="0" w:type="auto"/>
+            <w:vAlign w:val="center"/>
+            <w:hideMark/>
+          </w:tcPr>
+          <w:p>
+            <w:pPr>
+              <w:pStyle w:val="ListParagraph"/>
+            </w:pPr>
+            <w:r>
+              <w:t>Brings entire branch changes</w:t>
+            </w:r>
+          </w:p>
+        </w:tc>
+        <w:tc>
+          <w:tcPr>
+            <w:tcW w:w="0" w:type="auto"/>
+            <w:vAlign w:val="center"/>
+            <w:hideMark/>
+          </w:tcPr>
+          <w:p>
+            <w:pPr>
+              <w:pStyle w:val="ListParagraph"/>
+            </w:pPr>
+            <w:r>
+              <w:t>Brings only one specific commit</w:t>
+            </w:r>
+          </w:p>
+        </w:tc>
+      </w:tr>
+      <w:tr>
+        <w:trPr>
+          <w:tblCellSpacing w:w="15" w:type="dxa"/>
+        </w:trPr>
+        <w:tc>
+          <w:tcPr>
+            <w:tcW w:w="0" w:type="auto"/>
+            <w:vAlign w:val="center"/>
+            <w:hideMark/>
+          </w:tcPr>
+          <w:p>
+            <w:pPr>
+              <w:pStyle w:val="ListParagraph"/>
+            </w:pPr>
+            <w:r>
+              <w:t>Combines histories</w:t>
+            </w:r>
+          </w:p>
+        </w:tc>
+        <w:tc>
+          <w:tcPr>
+            <w:tcW w:w="0" w:type="auto"/>
+            <w:vAlign w:val="center"/>
+            <w:hideMark/>
+          </w:tcPr>
+          <w:p>
+            <w:pPr>
+              <w:pStyle w:val="ListParagraph"/>
+            </w:pPr>
+            <w:r>
+              <w:t>Copies commit changes</w:t>
+            </w:r>
+          </w:p>
+        </w:tc>
+      </w:tr>
+      <w:tr>
+        <w:trPr>
+          <w:tblCellSpacing w:w="15" w:type="dxa"/>
+        </w:trPr>
+        <w:tc>
+          <w:tcPr>
+            <w:tcW w:w="0" w:type="auto"/>
+            <w:vAlign w:val="center"/>
+            <w:hideMark/>
+          </w:tcPr>
+          <w:p>
+            <w:pPr>
+              <w:pStyle w:val="ListParagraph"/>
+            </w:pPr>
+            <w:r>
+              <w:t>Used for feature completion</w:t>
+            </w:r>
+          </w:p>
+        </w:tc>
+        <w:tc>
+          <w:tcPr>
+            <w:tcW w:w="0" w:type="auto"/>
+            <w:vAlign w:val="center"/>
+            <w:hideMark/>
+          </w:tcPr>
+          <w:p>
+            <w:pPr>
+              <w:pStyle w:val="ListParagraph"/>
+            </w:pPr>
+            <w:r>
+              <w:t>Used for selective changes</w:t>
+            </w:r>
+          </w:p>
+        </w:tc>
+      </w:tr>
+      <w:tr>
+        <w:trPr>
+          <w:trHeight w:val="447"/>
+          <w:tblCellSpacing w:w="15" w:type="dxa"/>
+        </w:trPr>
+        <w:tc>
+          <w:tcPr>
+            <w:tcW w:w="0" w:type="auto"/>
+            <w:vAlign w:val="center"/>
+          </w:tcPr>
+          <w:p>
+            <w:pPr>
+              <w:pStyle w:val="ListParagraph"/>
+            </w:pPr>
+            <w:r>
+              <w:t>Merge = copying all 5 paragraphs</w:t>
+            </w:r>
+          </w:p>
+        </w:tc>
+        <w:tc>
+          <w:tcPr>
+            <w:tcW w:w="0" w:type="auto"/>
+            <w:vAlign w:val="center"/>
+          </w:tcPr>
+          <w:p>
+            <w:pPr>
+              <w:pStyle w:val="ListParagraph"/>
+            </w:pPr>
+            <w:r>
+              <w:t>Cherry-pick = copying only paragraph 3</w:t>
+            </w:r>
+          </w:p>
+        </w:tc>
+      </w:tr>
+    </w:tbl>
+    <w:p>
+      <w:pPr>
+        <w:pStyle w:val="ListParagraph"/>
+      </w:pPr>
+    </w:p>
+    <w:p>
+      <w:pPr>
+        <w:pStyle w:val="ListParagraph"/>
+      </w:pPr>
+      <w:r>
+        <w:drawing>
+          <wp:inline distT="0" distB="0" distL="0" distR="0" wp14:anchorId="1BF20CF2" wp14:editId="4CB4A054">
+            <wp:extent cx="4330536" cy="1903863"/>
+            <wp:effectExtent l="0" t="0" r="0" b="1270"/>
+            <wp:docPr id="1151075379" name="Picture 1"/>
+            <wp:cNvGraphicFramePr>
+              <a:graphicFrameLocks xmlns:a="http://schemas.openxmlformats.org/drawingml/2006/main" noChangeAspect="1"/>
+            </wp:cNvGraphicFramePr>
+            <a:graphic xmlns:a="http://schemas.openxmlformats.org/drawingml/2006/main">
+              <a:graphicData uri="http://schemas.openxmlformats.org/drawingml/2006/picture">
+                <pic:pic xmlns:pic="http://schemas.openxmlformats.org/drawingml/2006/picture">
+                  <pic:nvPicPr>
+                    <pic:cNvPr id="1151075379" name=""/>
+                    <pic:cNvPicPr/>
+                  </pic:nvPicPr>
+                  <pic:blipFill>
+                    <a:blip r:embed="rId6"/>
+                    <a:stretch>
+                      <a:fillRect/>
+                    </a:stretch>
+                  </pic:blipFill>
+                  <pic:spPr>
+                    <a:xfrm>
+                      <a:off x="0" y="0"/>
+                      <a:ext cx="4336319" cy="1906405"/>
+                    </a:xfrm>
+                    <a:prstGeom prst="rect">
+                      <a:avLst/>
+                    </a:prstGeom>
+                  </pic:spPr>
+                </pic:pic>
+              </a:graphicData>
+            </a:graphic>
+          </wp:inline>
+        </w:drawing>
+      </w:r>
     </w:p>
     <w:sectPr>
       <w:pgSz w:w="12240" w:h="15840"/>
@@ -265,8 +990,284 @@
       </w:pPr>
     </w:lvl>
   </w:abstractNum>
+  <w:abstractNum w:abstractNumId="1" w15:restartNumberingAfterBreak="0">
+    <w:nsid w:val="28D6628C"/>
+    <w:multiLevelType w:val="hybridMultilevel"/>
+    <w:tmpl w:val="DC6215FA"/>
+    <w:lvl w:ilvl="0" w:tplc="0409000F">
+      <w:start w:val="1"/>
+      <w:numFmt w:val="decimal"/>
+      <w:lvlText w:val="%1."/>
+      <w:lvlJc w:val="left"/>
+      <w:pPr>
+        <w:ind w:left="720" w:hanging="360"/>
+      </w:pPr>
+      <w:rPr>
+        <w:rFonts w:hint="default"/>
+      </w:rPr>
+    </w:lvl>
+    <w:lvl w:ilvl="1" w:tplc="04090019" w:tentative="1">
+      <w:start w:val="1"/>
+      <w:numFmt w:val="lowerLetter"/>
+      <w:lvlText w:val="%2."/>
+      <w:lvlJc w:val="left"/>
+      <w:pPr>
+        <w:ind w:left="1440" w:hanging="360"/>
+      </w:pPr>
+    </w:lvl>
+    <w:lvl w:ilvl="2" w:tplc="0409001B" w:tentative="1">
+      <w:start w:val="1"/>
+      <w:numFmt w:val="lowerRoman"/>
+      <w:lvlText w:val="%3."/>
+      <w:lvlJc w:val="right"/>
+      <w:pPr>
+        <w:ind w:left="2160" w:hanging="180"/>
+      </w:pPr>
+    </w:lvl>
+    <w:lvl w:ilvl="3" w:tplc="0409000F" w:tentative="1">
+      <w:start w:val="1"/>
+      <w:numFmt w:val="decimal"/>
+      <w:lvlText w:val="%4."/>
+      <w:lvlJc w:val="left"/>
+      <w:pPr>
+        <w:ind w:left="2880" w:hanging="360"/>
+      </w:pPr>
+    </w:lvl>
+    <w:lvl w:ilvl="4" w:tplc="04090019" w:tentative="1">
+      <w:start w:val="1"/>
+      <w:numFmt w:val="lowerLetter"/>
+      <w:lvlText w:val="%5."/>
+      <w:lvlJc w:val="left"/>
+      <w:pPr>
+        <w:ind w:left="3600" w:hanging="360"/>
+      </w:pPr>
+    </w:lvl>
+    <w:lvl w:ilvl="5" w:tplc="0409001B" w:tentative="1">
+      <w:start w:val="1"/>
+      <w:numFmt w:val="lowerRoman"/>
+      <w:lvlText w:val="%6."/>
+      <w:lvlJc w:val="right"/>
+      <w:pPr>
+        <w:ind w:left="4320" w:hanging="180"/>
+      </w:pPr>
+    </w:lvl>
+    <w:lvl w:ilvl="6" w:tplc="0409000F" w:tentative="1">
+      <w:start w:val="1"/>
+      <w:numFmt w:val="decimal"/>
+      <w:lvlText w:val="%7."/>
+      <w:lvlJc w:val="left"/>
+      <w:pPr>
+        <w:ind w:left="5040" w:hanging="360"/>
+      </w:pPr>
+    </w:lvl>
+    <w:lvl w:ilvl="7" w:tplc="04090019" w:tentative="1">
+      <w:start w:val="1"/>
+      <w:numFmt w:val="lowerLetter"/>
+      <w:lvlText w:val="%8."/>
+      <w:lvlJc w:val="left"/>
+      <w:pPr>
+        <w:ind w:left="5760" w:hanging="360"/>
+      </w:pPr>
+    </w:lvl>
+    <w:lvl w:ilvl="8" w:tplc="0409001B" w:tentative="1">
+      <w:start w:val="1"/>
+      <w:numFmt w:val="lowerRoman"/>
+      <w:lvlText w:val="%9."/>
+      <w:lvlJc w:val="right"/>
+      <w:pPr>
+        <w:ind w:left="6480" w:hanging="180"/>
+      </w:pPr>
+    </w:lvl>
+  </w:abstractNum>
+  <w:abstractNum w:abstractNumId="2" w15:restartNumberingAfterBreak="0">
+    <w:nsid w:val="477F1E2A"/>
+    <w:multiLevelType w:val="hybridMultilevel"/>
+    <w:tmpl w:val="90A46564"/>
+    <w:lvl w:ilvl="0" w:tplc="43C2E5BA">
+      <w:start w:val="1"/>
+      <w:numFmt w:val="lowerLetter"/>
+      <w:lvlText w:val="%1."/>
+      <w:lvlJc w:val="left"/>
+      <w:pPr>
+        <w:ind w:left="1080" w:hanging="360"/>
+      </w:pPr>
+      <w:rPr>
+        <w:rFonts w:hint="default"/>
+      </w:rPr>
+    </w:lvl>
+    <w:lvl w:ilvl="1" w:tplc="04090019" w:tentative="1">
+      <w:start w:val="1"/>
+      <w:numFmt w:val="lowerLetter"/>
+      <w:lvlText w:val="%2."/>
+      <w:lvlJc w:val="left"/>
+      <w:pPr>
+        <w:ind w:left="1800" w:hanging="360"/>
+      </w:pPr>
+    </w:lvl>
+    <w:lvl w:ilvl="2" w:tplc="0409001B" w:tentative="1">
+      <w:start w:val="1"/>
+      <w:numFmt w:val="lowerRoman"/>
+      <w:lvlText w:val="%3."/>
+      <w:lvlJc w:val="right"/>
+      <w:pPr>
+        <w:ind w:left="2520" w:hanging="180"/>
+      </w:pPr>
+    </w:lvl>
+    <w:lvl w:ilvl="3" w:tplc="0409000F" w:tentative="1">
+      <w:start w:val="1"/>
+      <w:numFmt w:val="decimal"/>
+      <w:lvlText w:val="%4."/>
+      <w:lvlJc w:val="left"/>
+      <w:pPr>
+        <w:ind w:left="3240" w:hanging="360"/>
+      </w:pPr>
+    </w:lvl>
+    <w:lvl w:ilvl="4" w:tplc="04090019" w:tentative="1">
+      <w:start w:val="1"/>
+      <w:numFmt w:val="lowerLetter"/>
+      <w:lvlText w:val="%5."/>
+      <w:lvlJc w:val="left"/>
+      <w:pPr>
+        <w:ind w:left="3960" w:hanging="360"/>
+      </w:pPr>
+    </w:lvl>
+    <w:lvl w:ilvl="5" w:tplc="0409001B" w:tentative="1">
+      <w:start w:val="1"/>
+      <w:numFmt w:val="lowerRoman"/>
+      <w:lvlText w:val="%6."/>
+      <w:lvlJc w:val="right"/>
+      <w:pPr>
+        <w:ind w:left="4680" w:hanging="180"/>
+      </w:pPr>
+    </w:lvl>
+    <w:lvl w:ilvl="6" w:tplc="0409000F" w:tentative="1">
+      <w:start w:val="1"/>
+      <w:numFmt w:val="decimal"/>
+      <w:lvlText w:val="%7."/>
+      <w:lvlJc w:val="left"/>
+      <w:pPr>
+        <w:ind w:left="5400" w:hanging="360"/>
+      </w:pPr>
+    </w:lvl>
+    <w:lvl w:ilvl="7" w:tplc="04090019" w:tentative="1">
+      <w:start w:val="1"/>
+      <w:numFmt w:val="lowerLetter"/>
+      <w:lvlText w:val="%8."/>
+      <w:lvlJc w:val="left"/>
+      <w:pPr>
+        <w:ind w:left="6120" w:hanging="360"/>
+      </w:pPr>
+    </w:lvl>
+    <w:lvl w:ilvl="8" w:tplc="0409001B" w:tentative="1">
+      <w:start w:val="1"/>
+      <w:numFmt w:val="lowerRoman"/>
+      <w:lvlText w:val="%9."/>
+      <w:lvlJc w:val="right"/>
+      <w:pPr>
+        <w:ind w:left="6840" w:hanging="180"/>
+      </w:pPr>
+    </w:lvl>
+  </w:abstractNum>
+  <w:abstractNum w:abstractNumId="3" w15:restartNumberingAfterBreak="0">
+    <w:nsid w:val="4DDC3A75"/>
+    <w:multiLevelType w:val="hybridMultilevel"/>
+    <w:tmpl w:val="570A8306"/>
+    <w:lvl w:ilvl="0" w:tplc="0409000F">
+      <w:start w:val="1"/>
+      <w:numFmt w:val="decimal"/>
+      <w:lvlText w:val="%1."/>
+      <w:lvlJc w:val="left"/>
+      <w:pPr>
+        <w:ind w:left="720" w:hanging="360"/>
+      </w:pPr>
+      <w:rPr>
+        <w:rFonts w:hint="default"/>
+      </w:rPr>
+    </w:lvl>
+    <w:lvl w:ilvl="1" w:tplc="04090019" w:tentative="1">
+      <w:start w:val="1"/>
+      <w:numFmt w:val="lowerLetter"/>
+      <w:lvlText w:val="%2."/>
+      <w:lvlJc w:val="left"/>
+      <w:pPr>
+        <w:ind w:left="1440" w:hanging="360"/>
+      </w:pPr>
+    </w:lvl>
+    <w:lvl w:ilvl="2" w:tplc="0409001B" w:tentative="1">
+      <w:start w:val="1"/>
+      <w:numFmt w:val="lowerRoman"/>
+      <w:lvlText w:val="%3."/>
+      <w:lvlJc w:val="right"/>
+      <w:pPr>
+        <w:ind w:left="2160" w:hanging="180"/>
+      </w:pPr>
+    </w:lvl>
+    <w:lvl w:ilvl="3" w:tplc="0409000F" w:tentative="1">
+      <w:start w:val="1"/>
+      <w:numFmt w:val="decimal"/>
+      <w:lvlText w:val="%4."/>
+      <w:lvlJc w:val="left"/>
+      <w:pPr>
+        <w:ind w:left="2880" w:hanging="360"/>
+      </w:pPr>
+    </w:lvl>
+    <w:lvl w:ilvl="4" w:tplc="04090019" w:tentative="1">
+      <w:start w:val="1"/>
+      <w:numFmt w:val="lowerLetter"/>
+      <w:lvlText w:val="%5."/>
+      <w:lvlJc w:val="left"/>
+      <w:pPr>
+        <w:ind w:left="3600" w:hanging="360"/>
+      </w:pPr>
+    </w:lvl>
+    <w:lvl w:ilvl="5" w:tplc="0409001B" w:tentative="1">
+      <w:start w:val="1"/>
+      <w:numFmt w:val="lowerRoman"/>
+      <w:lvlText w:val="%6."/>
+      <w:lvlJc w:val="right"/>
+      <w:pPr>
+        <w:ind w:left="4320" w:hanging="180"/>
+      </w:pPr>
+    </w:lvl>
+    <w:lvl w:ilvl="6" w:tplc="0409000F" w:tentative="1">
+      <w:start w:val="1"/>
+      <w:numFmt w:val="decimal"/>
+      <w:lvlText w:val="%7."/>
+      <w:lvlJc w:val="left"/>
+      <w:pPr>
+        <w:ind w:left="5040" w:hanging="360"/>
+      </w:pPr>
+    </w:lvl>
+    <w:lvl w:ilvl="7" w:tplc="04090019" w:tentative="1">
+      <w:start w:val="1"/>
+      <w:numFmt w:val="lowerLetter"/>
+      <w:lvlText w:val="%8."/>
+      <w:lvlJc w:val="left"/>
+      <w:pPr>
+        <w:ind w:left="5760" w:hanging="360"/>
+      </w:pPr>
+    </w:lvl>
+    <w:lvl w:ilvl="8" w:tplc="0409001B" w:tentative="1">
+      <w:start w:val="1"/>
+      <w:numFmt w:val="lowerRoman"/>
+      <w:lvlText w:val="%9."/>
+      <w:lvlJc w:val="right"/>
+      <w:pPr>
+        <w:ind w:left="6480" w:hanging="180"/>
+      </w:pPr>
+    </w:lvl>
+  </w:abstractNum>
   <w:num w:numId="1" w16cid:durableId="239411980">
     <w:abstractNumId w:val="0"/>
+  </w:num>
+  <w:num w:numId="2" w16cid:durableId="732778755">
+    <w:abstractNumId w:val="2"/>
+  </w:num>
+  <w:num w:numId="3" w16cid:durableId="255939732">
+    <w:abstractNumId w:val="1"/>
+  </w:num>
+  <w:num w:numId="4" w16cid:durableId="252669623">
+    <w:abstractNumId w:val="3"/>
   </w:num>
 </w:numbering>
 </file>
@@ -874,7 +1875,6 @@
   <w:style w:type="character" w:default="1" w:styleId="DefaultParagraphFont">
     <w:name w:val="Default Paragraph Font"/>
     <w:uiPriority w:val="1"/>
-    <w:semiHidden/>
     <w:unhideWhenUsed/>
   </w:style>
   <w:style w:type="table" w:default="1" w:styleId="TableNormal">

</xml_diff>